<commit_message>
feat: bulk update website posts from Excel
</commit_message>
<xml_diff>
--- a/docs/Huong_dan_su_dung_PMEDIA_Dang_Bai_Tu_Dong_WordPress.docx
+++ b/docs/Huong_dan_su_dung_PMEDIA_Dang_Bai_Tu_Dong_WordPress.docx
@@ -27,7 +27,7 @@
           <w:color w:val="5A5A5A"/>
           <w:sz w:val="24"/>
         </w:rPr>
-        <w:t>Quy trình chuẩn bị Excel, đặt tên hình, kết nối WordPress, đăng bài, hẹn lịch và kiểm tra kết quả</w:t>
+        <w:t>Quy trình chuẩn bị Excel, đặt tên hình, kết nối WordPress, đăng bài, quản lý bài trên website, hẹn lịch và kiểm tra kết quả</w:t>
       </w:r>
     </w:p>
     <w:tbl>
@@ -157,6 +157,39 @@
           <w:rFonts w:ascii="Calibri" w:hAnsi="Calibri" w:eastAsia="Calibri"/>
         </w:rPr>
         <w:t>Lưu lịch sử các lần chạy trong tab Lịch sử.</w:t>
+      </w:r>
+    </w:p>
+    <w:p>
+      <w:pPr>
+        <w:pStyle w:val="ListBullet"/>
+      </w:pPr>
+      <w:r>
+        <w:rPr>
+          <w:rFonts w:ascii="Calibri" w:hAnsi="Calibri" w:eastAsia="Calibri"/>
+        </w:rPr>
+        <w:t>Lưu nhiều website WordPress đã kết nối để mở lại app không cần nhập lại.</w:t>
+      </w:r>
+    </w:p>
+    <w:p>
+      <w:pPr>
+        <w:pStyle w:val="ListBullet"/>
+      </w:pPr>
+      <w:r>
+        <w:rPr>
+          <w:rFonts w:ascii="Calibri" w:hAnsi="Calibri" w:eastAsia="Calibri"/>
+        </w:rPr>
+        <w:t>Nhận diện toàn bộ bài đang có trên website và thao tác hàng loạt với các bài đã chọn.</w:t>
+      </w:r>
+    </w:p>
+    <w:p>
+      <w:pPr>
+        <w:pStyle w:val="ListBullet"/>
+      </w:pPr>
+      <w:r>
+        <w:rPr>
+          <w:rFonts w:ascii="Calibri" w:hAnsi="Calibri" w:eastAsia="Calibri"/>
+        </w:rPr>
+        <w:t>Hỗ trợ xuất bản hàng loạt, sửa kích thước ảnh và căn ảnh cho bài đã đăng.</w:t>
       </w:r>
     </w:p>
     <w:p>
@@ -590,6 +623,56 @@
                 <w:sz w:val="22"/>
               </w:rPr>
               <w:t>wordpress\wordpress-auto-poster-rank-math-rest-meta.zip nếu cần ghi SEO fields Rank Math.</w:t>
+            </w:r>
+          </w:p>
+        </w:tc>
+      </w:tr>
+      <w:tr>
+        <w:tc>
+          <w:tcPr>
+            <w:tcW w:type="dxa" w:w="3024"/>
+            <w:tcMar>
+              <w:top w:w="80" w:type="dxa"/>
+              <w:start w:w="120" w:type="dxa"/>
+              <w:bottom w:w="80" w:type="dxa"/>
+              <w:end w:w="120" w:type="dxa"/>
+            </w:tcMar>
+            <w:vAlign w:val="center"/>
+          </w:tcPr>
+          <w:p>
+            <w:pPr>
+              <w:spacing w:after="0"/>
+            </w:pPr>
+            <w:r>
+              <w:rPr>
+                <w:rFonts w:ascii="Calibri" w:hAnsi="Calibri" w:eastAsia="Calibri"/>
+                <w:sz w:val="22"/>
+              </w:rPr>
+              <w:t>Danh sách website đã lưu</w:t>
+            </w:r>
+          </w:p>
+        </w:tc>
+        <w:tc>
+          <w:tcPr>
+            <w:tcW w:type="dxa" w:w="6336"/>
+            <w:tcMar>
+              <w:top w:w="80" w:type="dxa"/>
+              <w:start w:w="120" w:type="dxa"/>
+              <w:bottom w:w="80" w:type="dxa"/>
+              <w:end w:w="120" w:type="dxa"/>
+            </w:tcMar>
+            <w:vAlign w:val="center"/>
+          </w:tcPr>
+          <w:p>
+            <w:pPr>
+              <w:spacing w:after="0"/>
+            </w:pPr>
+            <w:r>
+              <w:rPr>
+                <w:rFonts w:ascii="Calibri" w:hAnsi="Calibri" w:eastAsia="Calibri"/>
+                <w:sz w:val="22"/>
+              </w:rPr>
+              <w:t>App tự lưu trong config\settings.json sau khi kết nối OK hoặc bấm Lưu.</w:t>
             </w:r>
           </w:p>
         </w:tc>
@@ -1124,7 +1207,7 @@
         <w:pStyle w:val="Heading2"/>
       </w:pPr>
       <w:r>
-        <w:t>3.2. Cài plugin metadata SEO cho Rank Math</w:t>
+        <w:t>3.2. Lưu website đã kết nối</w:t>
       </w:r>
     </w:p>
     <w:p>
@@ -1132,7 +1215,136 @@
         <w:rPr>
           <w:rFonts w:ascii="Calibri" w:hAnsi="Calibri" w:eastAsia="Calibri"/>
         </w:rPr>
-        <w:t>Plugin này giúp WordPress REST API cho phép app ghi Tiêu đề SEO, Thẻ mô tả, Từ khóa chính và permalink vào Rank Math. Nên cài plugin trước khi chạy đăng bài chính thức, đặc biệt nếu sau khi test các ô Rank Math vẫn hiện trống trong phần Xem trước trình chỉnh sửa đoạn trích.</w:t>
+        <w:t>App có thể lưu nhiều website WordPress đã kết nối. Sau khi tắt app rồi mở lại, người dùng chỉ cần chọn website trong ô Website đã lưu; URL, User và App Password sẽ tự được điền lại.</w:t>
+      </w:r>
+    </w:p>
+    <w:p>
+      <w:pPr>
+        <w:pStyle w:val="ListNumber"/>
+      </w:pPr>
+      <w:r>
+        <w:rPr>
+          <w:rFonts w:ascii="Calibri" w:hAnsi="Calibri" w:eastAsia="Calibri"/>
+        </w:rPr>
+        <w:t>Nhập URL, User và App Password của website.</w:t>
+      </w:r>
+    </w:p>
+    <w:p>
+      <w:pPr>
+        <w:pStyle w:val="ListNumber"/>
+      </w:pPr>
+      <w:r>
+        <w:rPr>
+          <w:rFonts w:ascii="Calibri" w:hAnsi="Calibri" w:eastAsia="Calibri"/>
+        </w:rPr>
+        <w:t>Bấm Kiểm tra kết nối. Nếu trạng thái báo OK, app tự lưu website này.</w:t>
+      </w:r>
+    </w:p>
+    <w:p>
+      <w:pPr>
+        <w:pStyle w:val="ListNumber"/>
+      </w:pPr>
+      <w:r>
+        <w:rPr>
+          <w:rFonts w:ascii="Calibri" w:hAnsi="Calibri" w:eastAsia="Calibri"/>
+        </w:rPr>
+        <w:t>Có thể bấm Lưu để lưu thủ công thông tin đang nhập.</w:t>
+      </w:r>
+    </w:p>
+    <w:p>
+      <w:pPr>
+        <w:pStyle w:val="ListNumber"/>
+      </w:pPr>
+      <w:r>
+        <w:rPr>
+          <w:rFonts w:ascii="Calibri" w:hAnsi="Calibri" w:eastAsia="Calibri"/>
+        </w:rPr>
+        <w:t>Lần sau mở app, website gần nhất sẽ tự được chọn và điền lại.</w:t>
+      </w:r>
+    </w:p>
+    <w:p>
+      <w:pPr>
+        <w:pStyle w:val="ListNumber"/>
+      </w:pPr>
+      <w:r>
+        <w:rPr>
+          <w:rFonts w:ascii="Calibri" w:hAnsi="Calibri" w:eastAsia="Calibri"/>
+        </w:rPr>
+        <w:t>Nếu quản lý nhiều website, chọn website cần dùng trong dropdown Website đã lưu.</w:t>
+      </w:r>
+    </w:p>
+    <w:p>
+      <w:pPr>
+        <w:pStyle w:val="ListNumber"/>
+      </w:pPr>
+      <w:r>
+        <w:rPr>
+          <w:rFonts w:ascii="Calibri" w:hAnsi="Calibri" w:eastAsia="Calibri"/>
+        </w:rPr>
+        <w:t>Muốn bỏ website khỏi máy, chọn website trong dropdown rồi bấm Xóa website đã lưu.</w:t>
+      </w:r>
+    </w:p>
+    <w:tbl>
+      <w:tblPr>
+        <w:tblStyle w:val="TableGrid"/>
+        <w:tblW w:type="dxa" w:w="9360"/>
+        <w:jc w:val="center"/>
+        <w:tblLayout w:type="fixed"/>
+        <w:tblLook w:firstColumn="1" w:firstRow="1" w:lastColumn="0" w:lastRow="0" w:noHBand="0" w:noVBand="1" w:val="04A0"/>
+      </w:tblPr>
+      <w:tblGrid>
+        <w:gridCol w:w="9360"/>
+      </w:tblGrid>
+      <w:tr>
+        <w:tc>
+          <w:tcPr>
+            <w:tcW w:type="dxa" w:w="9360"/>
+            <w:vAlign w:val="center"/>
+            <w:tcMar>
+              <w:top w:w="80" w:type="dxa"/>
+              <w:start w:w="120" w:type="dxa"/>
+              <w:bottom w:w="80" w:type="dxa"/>
+              <w:end w:w="120" w:type="dxa"/>
+            </w:tcMar>
+            <w:shd w:fill="E8EEF5"/>
+          </w:tcPr>
+          <w:p>
+            <w:pPr>
+              <w:spacing w:after="0"/>
+            </w:pPr>
+            <w:r>
+              <w:rPr>
+                <w:rFonts w:ascii="Calibri" w:hAnsi="Calibri" w:eastAsia="Calibri"/>
+                <w:b/>
+                <w:color w:val="1F4D78"/>
+              </w:rPr>
+              <w:t xml:space="preserve">Bảo mật App Password: </w:t>
+            </w:r>
+            <w:r>
+              <w:rPr>
+                <w:rFonts w:ascii="Calibri" w:hAnsi="Calibri" w:eastAsia="Calibri"/>
+              </w:rPr>
+              <w:t>App Password được mã hóa bằng Windows DPAPI theo user Windows hiện tại trước khi lưu vào config/settings.json. File settings này chỉ nên dùng trên đúng máy/user đã tạo; không nên gửi file config/settings.json cho khách khác.</w:t>
+            </w:r>
+          </w:p>
+        </w:tc>
+      </w:tr>
+    </w:tbl>
+    <w:p/>
+    <w:p>
+      <w:pPr>
+        <w:pStyle w:val="Heading2"/>
+      </w:pPr>
+      <w:r>
+        <w:t>3.3. Cài plugin metadata SEO cho Rank Math</w:t>
+      </w:r>
+    </w:p>
+    <w:p>
+      <w:r>
+        <w:rPr>
+          <w:rFonts w:ascii="Calibri" w:hAnsi="Calibri" w:eastAsia="Calibri"/>
+        </w:rPr>
+        <w:t>Plugin này giúp WordPress REST API cho phép app ghi Tiêu đề SEO, Thẻ mô tả, Từ khóa chính, toàn bộ từ khóa phụ và permalink vào Rank Math. Nên cài plugin trước khi chạy đăng bài chính thức, đặc biệt nếu sau khi test các ô Rank Math vẫn hiện trống trong phần Xem trước trình chỉnh sửa đoạn trích.</w:t>
       </w:r>
     </w:p>
     <w:p>
@@ -1220,7 +1432,7 @@
         <w:rPr>
           <w:rFonts w:ascii="Calibri" w:hAnsi="Calibri" w:eastAsia="Calibri"/>
         </w:rPr>
-        <w:t>Mở bài draft trong WordPress và kiểm tra Rank Math đã có Tiêu đề SEO, Thẻ mô tả và Từ khóa chính.</w:t>
+        <w:t>Mở bài draft trong WordPress và kiểm tra Rank Math đã có Tiêu đề SEO, Thẻ mô tả, từ khóa chính và các từ khóa phụ.</w:t>
       </w:r>
     </w:p>
     <w:tbl>
@@ -1263,7 +1475,7 @@
               <w:rPr>
                 <w:rFonts w:ascii="Calibri" w:hAnsi="Calibri" w:eastAsia="Calibri"/>
               </w:rPr>
-              <w:t>Nếu WordPress vẫn tạo được bài nhưng Rank Math không nhận SEO title, mô tả meta hoặc focus keyword, hãy cài plugin này rồi chạy lại. Với bài đã tồn tại, app sẽ cập nhật lại metadata SEO khi xử lý bài trùng.</w:t>
+              <w:t>Nếu WordPress vẫn tạo được bài nhưng Rank Math không nhận SEO title, mô tả meta hoặc focus keyword, hãy cài plugin bản 1.2.0 này rồi chạy lại. Với bài đã tồn tại, app sẽ cập nhật lại metadata SEO khi xử lý bài trùng. Nếu website đang dùng bản plugin cũ, hãy hủy kích hoạt/xóa bản cũ rồi tải lại file ZIP mới trong gói bàn giao.</w:t>
             </w:r>
           </w:p>
         </w:tc>
@@ -2040,7 +2252,7 @@
                 <w:rFonts w:ascii="Calibri" w:hAnsi="Calibri" w:eastAsia="Calibri"/>
                 <w:sz w:val="22"/>
               </w:rPr>
-              <w:t>Gộp vào Rank Math focus keyword, tách bằng dấu phẩy.</w:t>
+              <w:t>Gộp vào Rank Math focus keyword; tách bằng dấu phẩy, chấm phẩy, xuống dòng hoặc dấu |.</w:t>
             </w:r>
           </w:p>
         </w:tc>
@@ -2316,6 +2528,53 @@
       </w:tr>
     </w:tbl>
     <w:p/>
+    <w:tbl>
+      <w:tblPr>
+        <w:tblStyle w:val="TableGrid"/>
+        <w:tblW w:type="dxa" w:w="9360"/>
+        <w:jc w:val="center"/>
+        <w:tblLayout w:type="fixed"/>
+        <w:tblLook w:firstColumn="1" w:firstRow="1" w:lastColumn="0" w:lastRow="0" w:noHBand="0" w:noVBand="1" w:val="04A0"/>
+      </w:tblPr>
+      <w:tblGrid>
+        <w:gridCol w:w="9360"/>
+      </w:tblGrid>
+      <w:tr>
+        <w:tc>
+          <w:tcPr>
+            <w:tcW w:type="dxa" w:w="9360"/>
+            <w:vAlign w:val="center"/>
+            <w:tcMar>
+              <w:top w:w="80" w:type="dxa"/>
+              <w:start w:w="120" w:type="dxa"/>
+              <w:bottom w:w="80" w:type="dxa"/>
+              <w:end w:w="120" w:type="dxa"/>
+            </w:tcMar>
+            <w:shd w:fill="F4F6F9"/>
+          </w:tcPr>
+          <w:p>
+            <w:pPr>
+              <w:spacing w:after="0"/>
+            </w:pPr>
+            <w:r>
+              <w:rPr>
+                <w:rFonts w:ascii="Calibri" w:hAnsi="Calibri" w:eastAsia="Calibri"/>
+                <w:b/>
+                <w:color w:val="1F4D78"/>
+              </w:rPr>
+              <w:t xml:space="preserve">Kiểm tra từ khóa phụ trước khi đăng: </w:t>
+            </w:r>
+            <w:r>
+              <w:rPr>
+                <w:rFonts w:ascii="Calibri" w:hAnsi="Calibri" w:eastAsia="Calibri"/>
+              </w:rPr>
+              <w:t>Preview có cột Từ khóa Rank Math để hiển thị toàn bộ từ khóa sẽ gửi. Nếu file cũ không có cột Từ khóa phụ, có thể nhập nhiều giá trị ngay trong cột Từ khóa chính; app lấy giá trị đầu làm từ khóa chính và các giá trị còn lại làm từ khóa phụ. Plugin metadata cần được cập nhật lên bản 1.2.0 để dùng endpoint đồng bộ riêng của PMEDIA.</w:t>
+            </w:r>
+          </w:p>
+        </w:tc>
+      </w:tr>
+    </w:tbl>
+    <w:p/>
     <w:p>
       <w:pPr>
         <w:pStyle w:val="Heading2"/>
@@ -2354,7 +2613,7 @@
         <w:rPr>
           <w:rFonts w:ascii="Calibri" w:hAnsi="Calibri" w:eastAsia="Calibri"/>
         </w:rPr>
-        <w:t>Từ khóa phụ, tags nhập bằng dấu phẩy: từ khóa 1, từ khóa 2, từ khóa 3.</w:t>
+        <w:t>Từ khóa phụ có thể ngăn cách bằng dấu phẩy, chấm phẩy, xuống dòng hoặc dấu |. Tags vẫn là cột riêng của WordPress.</w:t>
       </w:r>
     </w:p>
     <w:p>
@@ -3302,7 +3561,464 @@
         <w:pStyle w:val="Heading1"/>
       </w:pPr>
       <w:r>
-        <w:t>7. Hẹn lịch tự động</w:t>
+        <w:t>7. Nhận diện và chỉnh sửa bài đang có trên website</w:t>
+      </w:r>
+    </w:p>
+    <w:p>
+      <w:r>
+        <w:rPr>
+          <w:rFonts w:ascii="Calibri" w:hAnsi="Calibri" w:eastAsia="Calibri"/>
+        </w:rPr>
+        <w:t>Tab Bài trên web dùng để tải toàn bộ bài viết đang có trong WordPress rồi thao tác hàng loạt trên các bài được chọn. Chức năng này không cần file Excel vì app làm việc trực tiếp theo ID bài viết WordPress.</w:t>
+      </w:r>
+    </w:p>
+    <w:p>
+      <w:pPr>
+        <w:pStyle w:val="ListNumber"/>
+      </w:pPr>
+      <w:r>
+        <w:rPr>
+          <w:rFonts w:ascii="Calibri" w:hAnsi="Calibri" w:eastAsia="Calibri"/>
+        </w:rPr>
+        <w:t>Kết nối WordPress thành công ở phần Kết nối WordPress.</w:t>
+      </w:r>
+    </w:p>
+    <w:p>
+      <w:pPr>
+        <w:pStyle w:val="ListNumber"/>
+      </w:pPr>
+      <w:r>
+        <w:rPr>
+          <w:rFonts w:ascii="Calibri" w:hAnsi="Calibri" w:eastAsia="Calibri"/>
+        </w:rPr>
+        <w:t>Mở tab Bài trên web.</w:t>
+      </w:r>
+    </w:p>
+    <w:p>
+      <w:pPr>
+        <w:pStyle w:val="ListNumber"/>
+      </w:pPr>
+      <w:r>
+        <w:rPr>
+          <w:rFonts w:ascii="Calibri" w:hAnsi="Calibri" w:eastAsia="Calibri"/>
+        </w:rPr>
+        <w:t>Bấm Tải bài từ website để app nhận diện bài publish, draft, pending, future và private.</w:t>
+      </w:r>
+    </w:p>
+    <w:p>
+      <w:pPr>
+        <w:pStyle w:val="ListNumber"/>
+      </w:pPr>
+      <w:r>
+        <w:rPr>
+          <w:rFonts w:ascii="Calibri" w:hAnsi="Calibri" w:eastAsia="Calibri"/>
+        </w:rPr>
+        <w:t>Tick chọn từng bài cần xử lý hoặc bấm Chọn tất cả.</w:t>
+      </w:r>
+    </w:p>
+    <w:p>
+      <w:pPr>
+        <w:pStyle w:val="ListNumber"/>
+      </w:pPr>
+      <w:r>
+        <w:rPr>
+          <w:rFonts w:ascii="Calibri" w:hAnsi="Calibri" w:eastAsia="Calibri"/>
+        </w:rPr>
+        <w:t>Nếu muốn public các bài nháp, bấm Xuất bản bài đã chọn.</w:t>
+      </w:r>
+    </w:p>
+    <w:p>
+      <w:pPr>
+        <w:pStyle w:val="ListNumber"/>
+      </w:pPr>
+      <w:r>
+        <w:rPr>
+          <w:rFonts w:ascii="Calibri" w:hAnsi="Calibri" w:eastAsia="Calibri"/>
+        </w:rPr>
+        <w:t>Nếu muốn sửa hình trong bài đã đăng, chọn Kích thước ảnh và Căn ảnh rồi bấm Sửa cỡ/căn ảnh bài đã chọn.</w:t>
+      </w:r>
+    </w:p>
+    <w:p>
+      <w:pPr>
+        <w:pStyle w:val="ListNumber"/>
+      </w:pPr>
+      <w:r>
+        <w:rPr>
+          <w:rFonts w:ascii="Calibri" w:hAnsi="Calibri" w:eastAsia="Calibri"/>
+        </w:rPr>
+        <w:t>Xem kết quả trong bảng Kết quả và kiểm tra lại vài link trên website.</w:t>
+      </w:r>
+    </w:p>
+    <w:tbl>
+      <w:tblPr>
+        <w:tblStyle w:val="TableGrid"/>
+        <w:tblW w:type="dxa" w:w="9360"/>
+        <w:jc w:val="center"/>
+        <w:tblLayout w:type="fixed"/>
+        <w:tblLook w:firstColumn="1" w:firstRow="1" w:lastColumn="0" w:lastRow="0" w:noHBand="0" w:noVBand="1" w:val="04A0"/>
+      </w:tblPr>
+      <w:tblGrid>
+        <w:gridCol w:w="3120"/>
+        <w:gridCol w:w="3120"/>
+        <w:gridCol w:w="3120"/>
+      </w:tblGrid>
+      <w:tr>
+        <w:tc>
+          <w:tcPr>
+            <w:tcW w:type="dxa" w:w="2520"/>
+            <w:vAlign w:val="center"/>
+            <w:tcMar>
+              <w:top w:w="80" w:type="dxa"/>
+              <w:start w:w="120" w:type="dxa"/>
+              <w:bottom w:w="80" w:type="dxa"/>
+              <w:end w:w="120" w:type="dxa"/>
+            </w:tcMar>
+            <w:shd w:fill="E8EEF5"/>
+          </w:tcPr>
+          <w:p>
+            <w:pPr>
+              <w:jc w:val="center"/>
+            </w:pPr>
+            <w:r>
+              <w:rPr>
+                <w:rFonts w:ascii="Calibri" w:hAnsi="Calibri" w:eastAsia="Calibri"/>
+                <w:b/>
+                <w:color w:val="1F4D78"/>
+              </w:rPr>
+              <w:t>Thao tác</w:t>
+            </w:r>
+          </w:p>
+        </w:tc>
+        <w:tc>
+          <w:tcPr>
+            <w:tcW w:type="dxa" w:w="3816"/>
+            <w:vAlign w:val="center"/>
+            <w:tcMar>
+              <w:top w:w="80" w:type="dxa"/>
+              <w:start w:w="120" w:type="dxa"/>
+              <w:bottom w:w="80" w:type="dxa"/>
+              <w:end w:w="120" w:type="dxa"/>
+            </w:tcMar>
+            <w:shd w:fill="E8EEF5"/>
+          </w:tcPr>
+          <w:p>
+            <w:pPr>
+              <w:jc w:val="center"/>
+            </w:pPr>
+            <w:r>
+              <w:rPr>
+                <w:rFonts w:ascii="Calibri" w:hAnsi="Calibri" w:eastAsia="Calibri"/>
+                <w:b/>
+                <w:color w:val="1F4D78"/>
+              </w:rPr>
+              <w:t>Tác dụng</w:t>
+            </w:r>
+          </w:p>
+        </w:tc>
+        <w:tc>
+          <w:tcPr>
+            <w:tcW w:type="dxa" w:w="3024"/>
+            <w:vAlign w:val="center"/>
+            <w:tcMar>
+              <w:top w:w="80" w:type="dxa"/>
+              <w:start w:w="120" w:type="dxa"/>
+              <w:bottom w:w="80" w:type="dxa"/>
+              <w:end w:w="120" w:type="dxa"/>
+            </w:tcMar>
+            <w:shd w:fill="E8EEF5"/>
+          </w:tcPr>
+          <w:p>
+            <w:pPr>
+              <w:jc w:val="center"/>
+            </w:pPr>
+            <w:r>
+              <w:rPr>
+                <w:rFonts w:ascii="Calibri" w:hAnsi="Calibri" w:eastAsia="Calibri"/>
+                <w:b/>
+                <w:color w:val="1F4D78"/>
+              </w:rPr>
+              <w:t>Không thay đổi</w:t>
+            </w:r>
+          </w:p>
+        </w:tc>
+      </w:tr>
+      <w:tr>
+        <w:tc>
+          <w:tcPr>
+            <w:tcW w:type="dxa" w:w="2520"/>
+            <w:tcMar>
+              <w:top w:w="80" w:type="dxa"/>
+              <w:start w:w="120" w:type="dxa"/>
+              <w:bottom w:w="80" w:type="dxa"/>
+              <w:end w:w="120" w:type="dxa"/>
+            </w:tcMar>
+            <w:vAlign w:val="center"/>
+          </w:tcPr>
+          <w:p>
+            <w:pPr>
+              <w:spacing w:after="0"/>
+            </w:pPr>
+            <w:r>
+              <w:rPr>
+                <w:rFonts w:ascii="Calibri" w:hAnsi="Calibri" w:eastAsia="Calibri"/>
+                <w:sz w:val="22"/>
+              </w:rPr>
+              <w:t>Tải bài từ website</w:t>
+            </w:r>
+          </w:p>
+        </w:tc>
+        <w:tc>
+          <w:tcPr>
+            <w:tcW w:type="dxa" w:w="3816"/>
+            <w:tcMar>
+              <w:top w:w="80" w:type="dxa"/>
+              <w:start w:w="120" w:type="dxa"/>
+              <w:bottom w:w="80" w:type="dxa"/>
+              <w:end w:w="120" w:type="dxa"/>
+            </w:tcMar>
+            <w:vAlign w:val="center"/>
+          </w:tcPr>
+          <w:p>
+            <w:pPr>
+              <w:spacing w:after="0"/>
+            </w:pPr>
+            <w:r>
+              <w:rPr>
+                <w:rFonts w:ascii="Calibri" w:hAnsi="Calibri" w:eastAsia="Calibri"/>
+                <w:sz w:val="22"/>
+              </w:rPr>
+              <w:t>Lấy danh sách bài viết theo ID, trạng thái, tiêu đề, slug và link.</w:t>
+            </w:r>
+          </w:p>
+        </w:tc>
+        <w:tc>
+          <w:tcPr>
+            <w:tcW w:type="dxa" w:w="3024"/>
+            <w:tcMar>
+              <w:top w:w="80" w:type="dxa"/>
+              <w:start w:w="120" w:type="dxa"/>
+              <w:bottom w:w="80" w:type="dxa"/>
+              <w:end w:w="120" w:type="dxa"/>
+            </w:tcMar>
+            <w:vAlign w:val="center"/>
+          </w:tcPr>
+          <w:p>
+            <w:pPr>
+              <w:spacing w:after="0"/>
+            </w:pPr>
+            <w:r>
+              <w:rPr>
+                <w:rFonts w:ascii="Calibri" w:hAnsi="Calibri" w:eastAsia="Calibri"/>
+                <w:sz w:val="22"/>
+              </w:rPr>
+              <w:t>Không sửa dữ liệu website.</w:t>
+            </w:r>
+          </w:p>
+        </w:tc>
+      </w:tr>
+      <w:tr>
+        <w:tc>
+          <w:tcPr>
+            <w:tcW w:type="dxa" w:w="2520"/>
+            <w:tcMar>
+              <w:top w:w="80" w:type="dxa"/>
+              <w:start w:w="120" w:type="dxa"/>
+              <w:bottom w:w="80" w:type="dxa"/>
+              <w:end w:w="120" w:type="dxa"/>
+            </w:tcMar>
+            <w:vAlign w:val="center"/>
+          </w:tcPr>
+          <w:p>
+            <w:pPr>
+              <w:spacing w:after="0"/>
+            </w:pPr>
+            <w:r>
+              <w:rPr>
+                <w:rFonts w:ascii="Calibri" w:hAnsi="Calibri" w:eastAsia="Calibri"/>
+                <w:sz w:val="22"/>
+              </w:rPr>
+              <w:t>Xuất bản bài đã chọn</w:t>
+            </w:r>
+          </w:p>
+        </w:tc>
+        <w:tc>
+          <w:tcPr>
+            <w:tcW w:type="dxa" w:w="3816"/>
+            <w:tcMar>
+              <w:top w:w="80" w:type="dxa"/>
+              <w:start w:w="120" w:type="dxa"/>
+              <w:bottom w:w="80" w:type="dxa"/>
+              <w:end w:w="120" w:type="dxa"/>
+            </w:tcMar>
+            <w:vAlign w:val="center"/>
+          </w:tcPr>
+          <w:p>
+            <w:pPr>
+              <w:spacing w:after="0"/>
+            </w:pPr>
+            <w:r>
+              <w:rPr>
+                <w:rFonts w:ascii="Calibri" w:hAnsi="Calibri" w:eastAsia="Calibri"/>
+                <w:sz w:val="22"/>
+              </w:rPr>
+              <w:t>Chuyển trạng thái bài đã chọn sang publish.</w:t>
+            </w:r>
+          </w:p>
+        </w:tc>
+        <w:tc>
+          <w:tcPr>
+            <w:tcW w:type="dxa" w:w="3024"/>
+            <w:tcMar>
+              <w:top w:w="80" w:type="dxa"/>
+              <w:start w:w="120" w:type="dxa"/>
+              <w:bottom w:w="80" w:type="dxa"/>
+              <w:end w:w="120" w:type="dxa"/>
+            </w:tcMar>
+            <w:vAlign w:val="center"/>
+          </w:tcPr>
+          <w:p>
+            <w:pPr>
+              <w:spacing w:after="0"/>
+            </w:pPr>
+            <w:r>
+              <w:rPr>
+                <w:rFonts w:ascii="Calibri" w:hAnsi="Calibri" w:eastAsia="Calibri"/>
+                <w:sz w:val="22"/>
+              </w:rPr>
+              <w:t>Không sửa nội dung, SEO, danh mục, tags hoặc ảnh.</w:t>
+            </w:r>
+          </w:p>
+        </w:tc>
+      </w:tr>
+      <w:tr>
+        <w:tc>
+          <w:tcPr>
+            <w:tcW w:type="dxa" w:w="2520"/>
+            <w:tcMar>
+              <w:top w:w="80" w:type="dxa"/>
+              <w:start w:w="120" w:type="dxa"/>
+              <w:bottom w:w="80" w:type="dxa"/>
+              <w:end w:w="120" w:type="dxa"/>
+            </w:tcMar>
+            <w:vAlign w:val="center"/>
+          </w:tcPr>
+          <w:p>
+            <w:pPr>
+              <w:spacing w:after="0"/>
+            </w:pPr>
+            <w:r>
+              <w:rPr>
+                <w:rFonts w:ascii="Calibri" w:hAnsi="Calibri" w:eastAsia="Calibri"/>
+                <w:sz w:val="22"/>
+              </w:rPr>
+              <w:t>Sửa cỡ/căn ảnh bài đã chọn</w:t>
+            </w:r>
+          </w:p>
+        </w:tc>
+        <w:tc>
+          <w:tcPr>
+            <w:tcW w:type="dxa" w:w="3816"/>
+            <w:tcMar>
+              <w:top w:w="80" w:type="dxa"/>
+              <w:start w:w="120" w:type="dxa"/>
+              <w:bottom w:w="80" w:type="dxa"/>
+              <w:end w:w="120" w:type="dxa"/>
+            </w:tcMar>
+            <w:vAlign w:val="center"/>
+          </w:tcPr>
+          <w:p>
+            <w:pPr>
+              <w:spacing w:after="0"/>
+            </w:pPr>
+            <w:r>
+              <w:rPr>
+                <w:rFonts w:ascii="Calibri" w:hAnsi="Calibri" w:eastAsia="Calibri"/>
+                <w:sz w:val="22"/>
+              </w:rPr>
+              <w:t>Cập nhật class căn ảnh và thuộc tính width/style của các thẻ img trong nội dung bài.</w:t>
+            </w:r>
+          </w:p>
+        </w:tc>
+        <w:tc>
+          <w:tcPr>
+            <w:tcW w:type="dxa" w:w="3024"/>
+            <w:tcMar>
+              <w:top w:w="80" w:type="dxa"/>
+              <w:start w:w="120" w:type="dxa"/>
+              <w:bottom w:w="80" w:type="dxa"/>
+              <w:end w:w="120" w:type="dxa"/>
+            </w:tcMar>
+            <w:vAlign w:val="center"/>
+          </w:tcPr>
+          <w:p>
+            <w:pPr>
+              <w:spacing w:after="0"/>
+            </w:pPr>
+            <w:r>
+              <w:rPr>
+                <w:rFonts w:ascii="Calibri" w:hAnsi="Calibri" w:eastAsia="Calibri"/>
+                <w:sz w:val="22"/>
+              </w:rPr>
+              <w:t>Không sửa chữ, tiêu đề, slug, SEO, danh mục hoặc tags.</w:t>
+            </w:r>
+          </w:p>
+        </w:tc>
+      </w:tr>
+    </w:tbl>
+    <w:p/>
+    <w:tbl>
+      <w:tblPr>
+        <w:tblStyle w:val="TableGrid"/>
+        <w:tblW w:type="dxa" w:w="9360"/>
+        <w:jc w:val="center"/>
+        <w:tblLayout w:type="fixed"/>
+        <w:tblLook w:firstColumn="1" w:firstRow="1" w:lastColumn="0" w:lastRow="0" w:noHBand="0" w:noVBand="1" w:val="04A0"/>
+      </w:tblPr>
+      <w:tblGrid>
+        <w:gridCol w:w="9360"/>
+      </w:tblGrid>
+      <w:tr>
+        <w:tc>
+          <w:tcPr>
+            <w:tcW w:type="dxa" w:w="9360"/>
+            <w:vAlign w:val="center"/>
+            <w:tcMar>
+              <w:top w:w="80" w:type="dxa"/>
+              <w:start w:w="120" w:type="dxa"/>
+              <w:bottom w:w="80" w:type="dxa"/>
+              <w:end w:w="120" w:type="dxa"/>
+            </w:tcMar>
+            <w:shd w:fill="FFF7E6"/>
+          </w:tcPr>
+          <w:p>
+            <w:pPr>
+              <w:spacing w:after="0"/>
+            </w:pPr>
+            <w:r>
+              <w:rPr>
+                <w:rFonts w:ascii="Calibri" w:hAnsi="Calibri" w:eastAsia="Calibri"/>
+                <w:b/>
+                <w:color w:val="1F4D78"/>
+              </w:rPr>
+              <w:t xml:space="preserve">Khi nào dùng tab Bài trên web?: </w:t>
+            </w:r>
+            <w:r>
+              <w:rPr>
+                <w:rFonts w:ascii="Calibri" w:hAnsi="Calibri" w:eastAsia="Calibri"/>
+              </w:rPr>
+              <w:t>Dùng khi bài đã tồn tại trong WordPress nhưng đang là draft cần xuất bản, hoặc khi muốn đổi cách hiển thị ảnh hàng loạt mà không muốn phụ thuộc file Excel cũ.</w:t>
+            </w:r>
+          </w:p>
+        </w:tc>
+      </w:tr>
+    </w:tbl>
+    <w:p/>
+    <w:p>
+      <w:pPr>
+        <w:pStyle w:val="Heading1"/>
+      </w:pPr>
+      <w:r>
+        <w:t>8. Hẹn lịch tự động</w:t>
       </w:r>
     </w:p>
     <w:p>
@@ -3811,7 +4527,7 @@
         <w:rPr>
           <w:rFonts w:ascii="Calibri" w:hAnsi="Calibri" w:eastAsia="Calibri"/>
         </w:rPr>
-        <w:t>Application Password không lưu vào settings. Khi mở app lại cần nhập lại password để lịch đăng được bài.</w:t>
+        <w:t>Nếu đã lưu website kết nối, app tự điền lại Application Password khi mở lại trên cùng máy/user Windows.</w:t>
       </w:r>
     </w:p>
     <w:p>
@@ -3830,7 +4546,7 @@
         <w:pStyle w:val="Heading1"/>
       </w:pPr>
       <w:r>
-        <w:t>8. Kết quả, file xuất và lịch sử chạy</w:t>
+        <w:t>9. Kết quả, file xuất và lịch sử chạy</w:t>
       </w:r>
     </w:p>
     <w:tbl>
@@ -4095,6 +4811,80 @@
                 <w:rFonts w:ascii="Calibri" w:hAnsi="Calibri" w:eastAsia="Calibri"/>
                 <w:sz w:val="22"/>
               </w:rPr>
+              <w:t>Kết quả bài trên web</w:t>
+            </w:r>
+          </w:p>
+        </w:tc>
+        <w:tc>
+          <w:tcPr>
+            <w:tcW w:type="dxa" w:w="4680"/>
+            <w:tcMar>
+              <w:top w:w="80" w:type="dxa"/>
+              <w:start w:w="120" w:type="dxa"/>
+              <w:bottom w:w="80" w:type="dxa"/>
+              <w:end w:w="120" w:type="dxa"/>
+            </w:tcMar>
+            <w:vAlign w:val="center"/>
+          </w:tcPr>
+          <w:p>
+            <w:pPr>
+              <w:spacing w:after="0"/>
+            </w:pPr>
+            <w:r>
+              <w:rPr>
+                <w:rFonts w:ascii="Calibri" w:hAnsi="Calibri" w:eastAsia="Calibri"/>
+                <w:sz w:val="22"/>
+              </w:rPr>
+              <w:t>Dòng theo ID bài WordPress, tiêu đề, trạng thái, link và lỗi nếu có.</w:t>
+            </w:r>
+          </w:p>
+        </w:tc>
+        <w:tc>
+          <w:tcPr>
+            <w:tcW w:type="dxa" w:w="2088"/>
+            <w:tcMar>
+              <w:top w:w="80" w:type="dxa"/>
+              <w:start w:w="120" w:type="dxa"/>
+              <w:bottom w:w="80" w:type="dxa"/>
+              <w:end w:w="120" w:type="dxa"/>
+            </w:tcMar>
+            <w:vAlign w:val="center"/>
+          </w:tcPr>
+          <w:p>
+            <w:pPr>
+              <w:spacing w:after="0"/>
+            </w:pPr>
+            <w:r>
+              <w:rPr>
+                <w:rFonts w:ascii="Calibri" w:hAnsi="Calibri" w:eastAsia="Calibri"/>
+                <w:sz w:val="22"/>
+              </w:rPr>
+              <w:t>Tab Bài trên web.</w:t>
+            </w:r>
+          </w:p>
+        </w:tc>
+      </w:tr>
+      <w:tr>
+        <w:tc>
+          <w:tcPr>
+            <w:tcW w:type="dxa" w:w="2592"/>
+            <w:tcMar>
+              <w:top w:w="80" w:type="dxa"/>
+              <w:start w:w="120" w:type="dxa"/>
+              <w:bottom w:w="80" w:type="dxa"/>
+              <w:end w:w="120" w:type="dxa"/>
+            </w:tcMar>
+            <w:vAlign w:val="center"/>
+          </w:tcPr>
+          <w:p>
+            <w:pPr>
+              <w:spacing w:after="0"/>
+            </w:pPr>
+            <w:r>
+              <w:rPr>
+                <w:rFonts w:ascii="Calibri" w:hAnsi="Calibri" w:eastAsia="Calibri"/>
+                <w:sz w:val="22"/>
+              </w:rPr>
               <w:t>Lịch sử chạy</w:t>
             </w:r>
           </w:p>
@@ -4222,6 +5012,154 @@
           </w:p>
         </w:tc>
       </w:tr>
+      <w:tr>
+        <w:tc>
+          <w:tcPr>
+            <w:tcW w:type="dxa" w:w="2592"/>
+            <w:tcMar>
+              <w:top w:w="80" w:type="dxa"/>
+              <w:start w:w="120" w:type="dxa"/>
+              <w:bottom w:w="80" w:type="dxa"/>
+              <w:end w:w="120" w:type="dxa"/>
+            </w:tcMar>
+            <w:vAlign w:val="center"/>
+          </w:tcPr>
+          <w:p>
+            <w:pPr>
+              <w:spacing w:after="0"/>
+            </w:pPr>
+            <w:r>
+              <w:rPr>
+                <w:rFonts w:ascii="Calibri" w:hAnsi="Calibri" w:eastAsia="Calibri"/>
+                <w:sz w:val="22"/>
+              </w:rPr>
+              <w:t>Toàn bộ bài trên website</w:t>
+            </w:r>
+          </w:p>
+        </w:tc>
+        <w:tc>
+          <w:tcPr>
+            <w:tcW w:type="dxa" w:w="4680"/>
+            <w:tcMar>
+              <w:top w:w="80" w:type="dxa"/>
+              <w:start w:w="120" w:type="dxa"/>
+              <w:bottom w:w="80" w:type="dxa"/>
+              <w:end w:w="120" w:type="dxa"/>
+            </w:tcMar>
+            <w:vAlign w:val="center"/>
+          </w:tcPr>
+          <w:p>
+            <w:pPr>
+              <w:spacing w:after="0"/>
+            </w:pPr>
+            <w:r>
+              <w:rPr>
+                <w:rFonts w:ascii="Calibri" w:hAnsi="Calibri" w:eastAsia="Calibri"/>
+                <w:sz w:val="20"/>
+              </w:rPr>
+              <w:t>Snapshot gồm ID, trạng thái, ngày đăng/cập nhật, tiêu đề, slug và link của toàn bộ bài WordPress.</w:t>
+            </w:r>
+          </w:p>
+        </w:tc>
+        <w:tc>
+          <w:tcPr>
+            <w:tcW w:type="dxa" w:w="2088"/>
+            <w:tcMar>
+              <w:top w:w="80" w:type="dxa"/>
+              <w:start w:w="120" w:type="dxa"/>
+              <w:bottom w:w="80" w:type="dxa"/>
+              <w:end w:w="120" w:type="dxa"/>
+            </w:tcMar>
+            <w:vAlign w:val="center"/>
+          </w:tcPr>
+          <w:p>
+            <w:pPr>
+              <w:spacing w:after="0"/>
+            </w:pPr>
+            <w:r>
+              <w:rPr>
+                <w:rFonts w:ascii="Calibri" w:hAnsi="Calibri" w:eastAsia="Calibri"/>
+                <w:sz w:val="22"/>
+              </w:rPr>
+              <w:t>Tab Lịch sử -&gt; Toàn bộ bài trên website.</w:t>
+            </w:r>
+          </w:p>
+        </w:tc>
+      </w:tr>
+      <w:tr>
+        <w:tc>
+          <w:tcPr>
+            <w:tcW w:type="dxa" w:w="2592"/>
+            <w:tcMar>
+              <w:top w:w="80" w:type="dxa"/>
+              <w:start w:w="120" w:type="dxa"/>
+              <w:bottom w:w="80" w:type="dxa"/>
+              <w:end w:w="120" w:type="dxa"/>
+            </w:tcMar>
+            <w:vAlign w:val="center"/>
+          </w:tcPr>
+          <w:p>
+            <w:pPr>
+              <w:spacing w:after="0"/>
+            </w:pPr>
+            <w:r>
+              <w:rPr>
+                <w:rFonts w:ascii="Calibri" w:hAnsi="Calibri" w:eastAsia="Calibri"/>
+                <w:sz w:val="22"/>
+              </w:rPr>
+              <w:t>File snapshot website</w:t>
+            </w:r>
+          </w:p>
+        </w:tc>
+        <w:tc>
+          <w:tcPr>
+            <w:tcW w:type="dxa" w:w="4680"/>
+            <w:tcMar>
+              <w:top w:w="80" w:type="dxa"/>
+              <w:start w:w="120" w:type="dxa"/>
+              <w:bottom w:w="80" w:type="dxa"/>
+              <w:end w:w="120" w:type="dxa"/>
+            </w:tcMar>
+            <w:vAlign w:val="center"/>
+          </w:tcPr>
+          <w:p>
+            <w:pPr>
+              <w:spacing w:after="0"/>
+            </w:pPr>
+            <w:r>
+              <w:rPr>
+                <w:rFonts w:ascii="Calibri" w:hAnsi="Calibri" w:eastAsia="Calibri"/>
+                <w:sz w:val="22"/>
+              </w:rPr>
+              <w:t>Lưu riêng theo từng website, không chứa App Password.</w:t>
+            </w:r>
+          </w:p>
+        </w:tc>
+        <w:tc>
+          <w:tcPr>
+            <w:tcW w:type="dxa" w:w="2088"/>
+            <w:tcMar>
+              <w:top w:w="80" w:type="dxa"/>
+              <w:start w:w="120" w:type="dxa"/>
+              <w:bottom w:w="80" w:type="dxa"/>
+              <w:end w:w="120" w:type="dxa"/>
+            </w:tcMar>
+            <w:vAlign w:val="center"/>
+          </w:tcPr>
+          <w:p>
+            <w:pPr>
+              <w:spacing w:after="0"/>
+            </w:pPr>
+            <w:r>
+              <w:rPr>
+                <w:rFonts w:ascii="Calibri" w:hAnsi="Calibri" w:eastAsia="Calibri"/>
+                <w:sz w:val="22"/>
+              </w:rPr>
+              <w:t>config\website_posts.json</w:t>
+            </w:r>
+          </w:p>
+        </w:tc>
+      </w:tr>
     </w:tbl>
     <w:p/>
     <w:p>
@@ -4270,10 +5208,21 @@
     </w:p>
     <w:p>
       <w:pPr>
+        <w:pStyle w:val="ListBullet"/>
+      </w:pPr>
+      <w:r>
+        <w:rPr>
+          <w:rFonts w:ascii="Calibri" w:hAnsi="Calibri" w:eastAsia="Calibri"/>
+        </w:rPr>
+        <w:t>Sau khi kết nối thành công, app tự đồng bộ toàn bộ bài. Có thể bấm Đồng bộ toàn bộ bài trong tab Lịch sử để tải lại.</w:t>
+      </w:r>
+    </w:p>
+    <w:p>
+      <w:pPr>
         <w:pStyle w:val="Heading1"/>
       </w:pPr>
       <w:r>
-        <w:t>9. Lỗi thường gặp và cách xử lý</w:t>
+        <w:t>10. Lỗi thường gặp và cách xử lý</w:t>
       </w:r>
     </w:p>
     <w:tbl>
@@ -4834,6 +5783,80 @@
                 <w:rFonts w:ascii="Calibri" w:hAnsi="Calibri" w:eastAsia="Calibri"/>
                 <w:sz w:val="22"/>
               </w:rPr>
+              <w:t>Rank Math chỉ có một từ khóa</w:t>
+            </w:r>
+          </w:p>
+        </w:tc>
+        <w:tc>
+          <w:tcPr>
+            <w:tcW w:type="dxa" w:w="3240"/>
+            <w:tcMar>
+              <w:top w:w="80" w:type="dxa"/>
+              <w:start w:w="120" w:type="dxa"/>
+              <w:bottom w:w="80" w:type="dxa"/>
+              <w:end w:w="120" w:type="dxa"/>
+            </w:tcMar>
+            <w:vAlign w:val="center"/>
+          </w:tcPr>
+          <w:p>
+            <w:pPr>
+              <w:spacing w:after="0"/>
+            </w:pPr>
+            <w:r>
+              <w:rPr>
+                <w:rFonts w:ascii="Calibri" w:hAnsi="Calibri" w:eastAsia="Calibri"/>
+                <w:sz w:val="22"/>
+              </w:rPr>
+              <w:t>File Excel không có cột Từ khóa phụ hoặc plugin metadata còn cũ</w:t>
+            </w:r>
+          </w:p>
+        </w:tc>
+        <w:tc>
+          <w:tcPr>
+            <w:tcW w:type="dxa" w:w="3671"/>
+            <w:tcMar>
+              <w:top w:w="80" w:type="dxa"/>
+              <w:start w:w="120" w:type="dxa"/>
+              <w:bottom w:w="80" w:type="dxa"/>
+              <w:end w:w="120" w:type="dxa"/>
+            </w:tcMar>
+            <w:vAlign w:val="center"/>
+          </w:tcPr>
+          <w:p>
+            <w:pPr>
+              <w:spacing w:after="0"/>
+            </w:pPr>
+            <w:r>
+              <w:rPr>
+                <w:rFonts w:ascii="Calibri" w:hAnsi="Calibri" w:eastAsia="Calibri"/>
+                <w:sz w:val="20"/>
+              </w:rPr>
+              <w:t>Thêm cột Từ khóa phụ, kiểm tra cột Từ khóa Rank Math trong Preview và cập nhật plugin metadata bản 1.2.0.</w:t>
+            </w:r>
+          </w:p>
+        </w:tc>
+      </w:tr>
+      <w:tr>
+        <w:tc>
+          <w:tcPr>
+            <w:tcW w:type="dxa" w:w="2448"/>
+            <w:tcMar>
+              <w:top w:w="80" w:type="dxa"/>
+              <w:start w:w="120" w:type="dxa"/>
+              <w:bottom w:w="80" w:type="dxa"/>
+              <w:end w:w="120" w:type="dxa"/>
+            </w:tcMar>
+            <w:vAlign w:val="center"/>
+          </w:tcPr>
+          <w:p>
+            <w:pPr>
+              <w:spacing w:after="0"/>
+            </w:pPr>
+            <w:r>
+              <w:rPr>
+                <w:rFonts w:ascii="Calibri" w:hAnsi="Calibri" w:eastAsia="Calibri"/>
+                <w:sz w:val="22"/>
+              </w:rPr>
               <w:t>Bài bị draft</w:t>
             </w:r>
           </w:p>
@@ -4908,6 +5931,302 @@
                 <w:rFonts w:ascii="Calibri" w:hAnsi="Calibri" w:eastAsia="Calibri"/>
                 <w:sz w:val="22"/>
               </w:rPr>
+              <w:t>Dropdown Website đã lưu trống</w:t>
+            </w:r>
+          </w:p>
+        </w:tc>
+        <w:tc>
+          <w:tcPr>
+            <w:tcW w:type="dxa" w:w="3240"/>
+            <w:tcMar>
+              <w:top w:w="80" w:type="dxa"/>
+              <w:start w:w="120" w:type="dxa"/>
+              <w:bottom w:w="80" w:type="dxa"/>
+              <w:end w:w="120" w:type="dxa"/>
+            </w:tcMar>
+            <w:vAlign w:val="center"/>
+          </w:tcPr>
+          <w:p>
+            <w:pPr>
+              <w:spacing w:after="0"/>
+            </w:pPr>
+            <w:r>
+              <w:rPr>
+                <w:rFonts w:ascii="Calibri" w:hAnsi="Calibri" w:eastAsia="Calibri"/>
+                <w:sz w:val="22"/>
+              </w:rPr>
+              <w:t>Chưa bấm Lưu hoặc chưa test kết nối OK</w:t>
+            </w:r>
+          </w:p>
+        </w:tc>
+        <w:tc>
+          <w:tcPr>
+            <w:tcW w:type="dxa" w:w="3671"/>
+            <w:tcMar>
+              <w:top w:w="80" w:type="dxa"/>
+              <w:start w:w="120" w:type="dxa"/>
+              <w:bottom w:w="80" w:type="dxa"/>
+              <w:end w:w="120" w:type="dxa"/>
+            </w:tcMar>
+            <w:vAlign w:val="center"/>
+          </w:tcPr>
+          <w:p>
+            <w:pPr>
+              <w:spacing w:after="0"/>
+            </w:pPr>
+            <w:r>
+              <w:rPr>
+                <w:rFonts w:ascii="Calibri" w:hAnsi="Calibri" w:eastAsia="Calibri"/>
+                <w:sz w:val="22"/>
+              </w:rPr>
+              <w:t>Nhập đủ URL/User/App Password rồi bấm Kiểm tra kết nối hoặc Lưu.</w:t>
+            </w:r>
+          </w:p>
+        </w:tc>
+      </w:tr>
+      <w:tr>
+        <w:tc>
+          <w:tcPr>
+            <w:tcW w:type="dxa" w:w="2448"/>
+            <w:tcMar>
+              <w:top w:w="80" w:type="dxa"/>
+              <w:start w:w="120" w:type="dxa"/>
+              <w:bottom w:w="80" w:type="dxa"/>
+              <w:end w:w="120" w:type="dxa"/>
+            </w:tcMar>
+            <w:vAlign w:val="center"/>
+          </w:tcPr>
+          <w:p>
+            <w:pPr>
+              <w:spacing w:after="0"/>
+            </w:pPr>
+            <w:r>
+              <w:rPr>
+                <w:rFonts w:ascii="Calibri" w:hAnsi="Calibri" w:eastAsia="Calibri"/>
+                <w:sz w:val="22"/>
+              </w:rPr>
+              <w:t>Không giải mã được App Password đã lưu</w:t>
+            </w:r>
+          </w:p>
+        </w:tc>
+        <w:tc>
+          <w:tcPr>
+            <w:tcW w:type="dxa" w:w="3240"/>
+            <w:tcMar>
+              <w:top w:w="80" w:type="dxa"/>
+              <w:start w:w="120" w:type="dxa"/>
+              <w:bottom w:w="80" w:type="dxa"/>
+              <w:end w:w="120" w:type="dxa"/>
+            </w:tcMar>
+            <w:vAlign w:val="center"/>
+          </w:tcPr>
+          <w:p>
+            <w:pPr>
+              <w:spacing w:after="0"/>
+            </w:pPr>
+            <w:r>
+              <w:rPr>
+                <w:rFonts w:ascii="Calibri" w:hAnsi="Calibri" w:eastAsia="Calibri"/>
+                <w:sz w:val="22"/>
+              </w:rPr>
+              <w:t>File settings được chuyển từ máy/user Windows khác</w:t>
+            </w:r>
+          </w:p>
+        </w:tc>
+        <w:tc>
+          <w:tcPr>
+            <w:tcW w:type="dxa" w:w="3671"/>
+            <w:tcMar>
+              <w:top w:w="80" w:type="dxa"/>
+              <w:start w:w="120" w:type="dxa"/>
+              <w:bottom w:w="80" w:type="dxa"/>
+              <w:end w:w="120" w:type="dxa"/>
+            </w:tcMar>
+            <w:vAlign w:val="center"/>
+          </w:tcPr>
+          <w:p>
+            <w:pPr>
+              <w:spacing w:after="0"/>
+            </w:pPr>
+            <w:r>
+              <w:rPr>
+                <w:rFonts w:ascii="Calibri" w:hAnsi="Calibri" w:eastAsia="Calibri"/>
+                <w:sz w:val="22"/>
+              </w:rPr>
+              <w:t>Nhập lại App Password trên máy hiện tại rồi bấm Lưu.</w:t>
+            </w:r>
+          </w:p>
+        </w:tc>
+      </w:tr>
+      <w:tr>
+        <w:tc>
+          <w:tcPr>
+            <w:tcW w:type="dxa" w:w="2448"/>
+            <w:tcMar>
+              <w:top w:w="80" w:type="dxa"/>
+              <w:start w:w="120" w:type="dxa"/>
+              <w:bottom w:w="80" w:type="dxa"/>
+              <w:end w:w="120" w:type="dxa"/>
+            </w:tcMar>
+            <w:vAlign w:val="center"/>
+          </w:tcPr>
+          <w:p>
+            <w:pPr>
+              <w:spacing w:after="0"/>
+            </w:pPr>
+            <w:r>
+              <w:rPr>
+                <w:rFonts w:ascii="Calibri" w:hAnsi="Calibri" w:eastAsia="Calibri"/>
+                <w:sz w:val="22"/>
+              </w:rPr>
+              <w:t>Tab Bài trên web không tải được bài</w:t>
+            </w:r>
+          </w:p>
+        </w:tc>
+        <w:tc>
+          <w:tcPr>
+            <w:tcW w:type="dxa" w:w="3240"/>
+            <w:tcMar>
+              <w:top w:w="80" w:type="dxa"/>
+              <w:start w:w="120" w:type="dxa"/>
+              <w:bottom w:w="80" w:type="dxa"/>
+              <w:end w:w="120" w:type="dxa"/>
+            </w:tcMar>
+            <w:vAlign w:val="center"/>
+          </w:tcPr>
+          <w:p>
+            <w:pPr>
+              <w:spacing w:after="0"/>
+            </w:pPr>
+            <w:r>
+              <w:rPr>
+                <w:rFonts w:ascii="Calibri" w:hAnsi="Calibri" w:eastAsia="Calibri"/>
+                <w:sz w:val="22"/>
+              </w:rPr>
+              <w:t>User thiếu quyền hoặc REST API bị chặn</w:t>
+            </w:r>
+          </w:p>
+        </w:tc>
+        <w:tc>
+          <w:tcPr>
+            <w:tcW w:type="dxa" w:w="3671"/>
+            <w:tcMar>
+              <w:top w:w="80" w:type="dxa"/>
+              <w:start w:w="120" w:type="dxa"/>
+              <w:bottom w:w="80" w:type="dxa"/>
+              <w:end w:w="120" w:type="dxa"/>
+            </w:tcMar>
+            <w:vAlign w:val="center"/>
+          </w:tcPr>
+          <w:p>
+            <w:pPr>
+              <w:spacing w:after="0"/>
+            </w:pPr>
+            <w:r>
+              <w:rPr>
+                <w:rFonts w:ascii="Calibri" w:hAnsi="Calibri" w:eastAsia="Calibri"/>
+                <w:sz w:val="22"/>
+              </w:rPr>
+              <w:t>Kiểm tra quyền user, Application Password và plugin bảo mật/hosting.</w:t>
+            </w:r>
+          </w:p>
+        </w:tc>
+      </w:tr>
+      <w:tr>
+        <w:tc>
+          <w:tcPr>
+            <w:tcW w:type="dxa" w:w="2448"/>
+            <w:tcMar>
+              <w:top w:w="80" w:type="dxa"/>
+              <w:start w:w="120" w:type="dxa"/>
+              <w:bottom w:w="80" w:type="dxa"/>
+              <w:end w:w="120" w:type="dxa"/>
+            </w:tcMar>
+            <w:vAlign w:val="center"/>
+          </w:tcPr>
+          <w:p>
+            <w:pPr>
+              <w:spacing w:after="0"/>
+            </w:pPr>
+            <w:r>
+              <w:rPr>
+                <w:rFonts w:ascii="Calibri" w:hAnsi="Calibri" w:eastAsia="Calibri"/>
+                <w:sz w:val="22"/>
+              </w:rPr>
+              <w:t>Lịch sử chưa có toàn bộ bài website</w:t>
+            </w:r>
+          </w:p>
+        </w:tc>
+        <w:tc>
+          <w:tcPr>
+            <w:tcW w:type="dxa" w:w="3240"/>
+            <w:tcMar>
+              <w:top w:w="80" w:type="dxa"/>
+              <w:start w:w="120" w:type="dxa"/>
+              <w:bottom w:w="80" w:type="dxa"/>
+              <w:end w:w="120" w:type="dxa"/>
+            </w:tcMar>
+            <w:vAlign w:val="center"/>
+          </w:tcPr>
+          <w:p>
+            <w:pPr>
+              <w:spacing w:after="0"/>
+            </w:pPr>
+            <w:r>
+              <w:rPr>
+                <w:rFonts w:ascii="Calibri" w:hAnsi="Calibri" w:eastAsia="Calibri"/>
+                <w:sz w:val="22"/>
+              </w:rPr>
+              <w:t>Chưa đồng bộ hoặc lần tải gần nhất bị lỗi</w:t>
+            </w:r>
+          </w:p>
+        </w:tc>
+        <w:tc>
+          <w:tcPr>
+            <w:tcW w:type="dxa" w:w="3671"/>
+            <w:tcMar>
+              <w:top w:w="80" w:type="dxa"/>
+              <w:start w:w="120" w:type="dxa"/>
+              <w:bottom w:w="80" w:type="dxa"/>
+              <w:end w:w="120" w:type="dxa"/>
+            </w:tcMar>
+            <w:vAlign w:val="center"/>
+          </w:tcPr>
+          <w:p>
+            <w:pPr>
+              <w:spacing w:after="0"/>
+            </w:pPr>
+            <w:r>
+              <w:rPr>
+                <w:rFonts w:ascii="Calibri" w:hAnsi="Calibri" w:eastAsia="Calibri"/>
+                <w:sz w:val="22"/>
+              </w:rPr>
+              <w:t>Kết nối lại rồi mở Lịch sử -&gt; Toàn bộ bài trên website -&gt; Đồng bộ toàn bộ bài.</w:t>
+            </w:r>
+          </w:p>
+        </w:tc>
+      </w:tr>
+      <w:tr>
+        <w:tc>
+          <w:tcPr>
+            <w:tcW w:type="dxa" w:w="2448"/>
+            <w:tcMar>
+              <w:top w:w="80" w:type="dxa"/>
+              <w:start w:w="120" w:type="dxa"/>
+              <w:bottom w:w="80" w:type="dxa"/>
+              <w:end w:w="120" w:type="dxa"/>
+            </w:tcMar>
+            <w:vAlign w:val="center"/>
+          </w:tcPr>
+          <w:p>
+            <w:pPr>
+              <w:spacing w:after="0"/>
+            </w:pPr>
+            <w:r>
+              <w:rPr>
+                <w:rFonts w:ascii="Calibri" w:hAnsi="Calibri" w:eastAsia="Calibri"/>
+                <w:sz w:val="22"/>
+              </w:rPr>
               <w:t>Lịch không chạy</w:t>
             </w:r>
           </w:p>
@@ -4932,7 +6251,7 @@
                 <w:rFonts w:ascii="Calibri" w:hAnsi="Calibri" w:eastAsia="Calibri"/>
                 <w:sz w:val="22"/>
               </w:rPr>
-              <w:t>Chưa tick bật lịch, app đã thoát hẳn hoặc chưa nhập password</w:t>
+              <w:t>Chưa tick bật lịch hoặc app đã thoát hẳn</w:t>
             </w:r>
           </w:p>
         </w:tc>
@@ -4956,7 +6275,7 @@
                 <w:rFonts w:ascii="Calibri" w:hAnsi="Calibri" w:eastAsia="Calibri"/>
                 <w:sz w:val="22"/>
               </w:rPr>
-              <w:t>Bật lịch, để app ở khay hệ thống, nhập lại Application Password sau khi mở app.</w:t>
+              <w:t>Bật lịch, để app ở khay hệ thống và kiểm tra lại cấu hình kết nối đã lưu.</w:t>
             </w:r>
           </w:p>
         </w:tc>
@@ -5042,7 +6361,7 @@
         <w:pStyle w:val="Heading1"/>
       </w:pPr>
       <w:r>
-        <w:t>10. Nguyên tắc an toàn khi đăng hàng loạt</w:t>
+        <w:t>11. Nguyên tắc an toàn khi đăng hàng loạt</w:t>
       </w:r>
     </w:p>
     <w:p>
@@ -5086,7 +6405,29 @@
         <w:rPr>
           <w:rFonts w:ascii="Calibri" w:hAnsi="Calibri" w:eastAsia="Calibri"/>
         </w:rPr>
+        <w:t>Không gửi config/settings.json cho người khác vì file này chứa hồ sơ website đã lưu cho máy hiện tại.</w:t>
+      </w:r>
+    </w:p>
+    <w:p>
+      <w:pPr>
+        <w:pStyle w:val="ListBullet"/>
+      </w:pPr>
+      <w:r>
+        <w:rPr>
+          <w:rFonts w:ascii="Calibri" w:hAnsi="Calibri" w:eastAsia="Calibri"/>
+        </w:rPr>
         <w:t>Không đóng app bằng Thoát hẳn khi đang đăng bài.</w:t>
+      </w:r>
+    </w:p>
+    <w:p>
+      <w:pPr>
+        <w:pStyle w:val="ListBullet"/>
+      </w:pPr>
+      <w:r>
+        <w:rPr>
+          <w:rFonts w:ascii="Calibri" w:hAnsi="Calibri" w:eastAsia="Calibri"/>
+        </w:rPr>
+        <w:t>Trước khi dùng tab Bài trên web để xuất bản hoặc sửa ảnh hàng loạt, nên tick thử 1-2 bài để kiểm tra kết quả.</w:t>
       </w:r>
     </w:p>
     <w:p>
@@ -5116,7 +6457,7 @@
         <w:pStyle w:val="Heading1"/>
       </w:pPr>
       <w:r>
-        <w:t>11. Tóm tắt thao tác nhanh</w:t>
+        <w:t>12. Tóm tắt thao tác nhanh</w:t>
       </w:r>
     </w:p>
     <w:tbl>
@@ -5306,6 +6647,156 @@
                 <w:rFonts w:ascii="Calibri" w:hAnsi="Calibri" w:eastAsia="Calibri"/>
                 <w:sz w:val="22"/>
               </w:rPr>
+              <w:t>Lưu website kết nối</w:t>
+            </w:r>
+          </w:p>
+        </w:tc>
+        <w:tc>
+          <w:tcPr>
+            <w:tcW w:type="dxa" w:w="6480"/>
+            <w:tcMar>
+              <w:top w:w="80" w:type="dxa"/>
+              <w:start w:w="120" w:type="dxa"/>
+              <w:bottom w:w="80" w:type="dxa"/>
+              <w:end w:w="120" w:type="dxa"/>
+            </w:tcMar>
+            <w:vAlign w:val="center"/>
+          </w:tcPr>
+          <w:p>
+            <w:pPr>
+              <w:spacing w:after="0"/>
+            </w:pPr>
+            <w:r>
+              <w:rPr>
+                <w:rFonts w:ascii="Calibri" w:hAnsi="Calibri" w:eastAsia="Calibri"/>
+                <w:sz w:val="20"/>
+              </w:rPr>
+              <w:t>Nhập URL/User/App Password -&gt; Kiểm tra kết nối OK hoặc bấm Lưu -&gt; lần sau chọn trong Website đã lưu.</w:t>
+            </w:r>
+          </w:p>
+        </w:tc>
+      </w:tr>
+      <w:tr>
+        <w:tc>
+          <w:tcPr>
+            <w:tcW w:type="dxa" w:w="2880"/>
+            <w:tcMar>
+              <w:top w:w="80" w:type="dxa"/>
+              <w:start w:w="120" w:type="dxa"/>
+              <w:bottom w:w="80" w:type="dxa"/>
+              <w:end w:w="120" w:type="dxa"/>
+            </w:tcMar>
+            <w:vAlign w:val="center"/>
+          </w:tcPr>
+          <w:p>
+            <w:pPr>
+              <w:spacing w:after="0"/>
+            </w:pPr>
+            <w:r>
+              <w:rPr>
+                <w:rFonts w:ascii="Calibri" w:hAnsi="Calibri" w:eastAsia="Calibri"/>
+                <w:sz w:val="22"/>
+              </w:rPr>
+              <w:t>Xuất bản bài đang có trên web</w:t>
+            </w:r>
+          </w:p>
+        </w:tc>
+        <w:tc>
+          <w:tcPr>
+            <w:tcW w:type="dxa" w:w="6480"/>
+            <w:tcMar>
+              <w:top w:w="80" w:type="dxa"/>
+              <w:start w:w="120" w:type="dxa"/>
+              <w:bottom w:w="80" w:type="dxa"/>
+              <w:end w:w="120" w:type="dxa"/>
+            </w:tcMar>
+            <w:vAlign w:val="center"/>
+          </w:tcPr>
+          <w:p>
+            <w:pPr>
+              <w:spacing w:after="0"/>
+            </w:pPr>
+            <w:r>
+              <w:rPr>
+                <w:rFonts w:ascii="Calibri" w:hAnsi="Calibri" w:eastAsia="Calibri"/>
+                <w:sz w:val="22"/>
+              </w:rPr>
+              <w:t>Tab Bài trên web -&gt; Tải bài từ website -&gt; tick bài -&gt; Xuất bản bài đã chọn.</w:t>
+            </w:r>
+          </w:p>
+        </w:tc>
+      </w:tr>
+      <w:tr>
+        <w:tc>
+          <w:tcPr>
+            <w:tcW w:type="dxa" w:w="2880"/>
+            <w:tcMar>
+              <w:top w:w="80" w:type="dxa"/>
+              <w:start w:w="120" w:type="dxa"/>
+              <w:bottom w:w="80" w:type="dxa"/>
+              <w:end w:w="120" w:type="dxa"/>
+            </w:tcMar>
+            <w:vAlign w:val="center"/>
+          </w:tcPr>
+          <w:p>
+            <w:pPr>
+              <w:spacing w:after="0"/>
+            </w:pPr>
+            <w:r>
+              <w:rPr>
+                <w:rFonts w:ascii="Calibri" w:hAnsi="Calibri" w:eastAsia="Calibri"/>
+                <w:sz w:val="22"/>
+              </w:rPr>
+              <w:t>Sửa ảnh bài đang có trên web</w:t>
+            </w:r>
+          </w:p>
+        </w:tc>
+        <w:tc>
+          <w:tcPr>
+            <w:tcW w:type="dxa" w:w="6480"/>
+            <w:tcMar>
+              <w:top w:w="80" w:type="dxa"/>
+              <w:start w:w="120" w:type="dxa"/>
+              <w:bottom w:w="80" w:type="dxa"/>
+              <w:end w:w="120" w:type="dxa"/>
+            </w:tcMar>
+            <w:vAlign w:val="center"/>
+          </w:tcPr>
+          <w:p>
+            <w:pPr>
+              <w:spacing w:after="0"/>
+            </w:pPr>
+            <w:r>
+              <w:rPr>
+                <w:rFonts w:ascii="Calibri" w:hAnsi="Calibri" w:eastAsia="Calibri"/>
+                <w:sz w:val="22"/>
+              </w:rPr>
+              <w:t>Tab Bài trên web -&gt; chọn kích thước/căn ảnh -&gt; tick bài -&gt; Sửa cỡ/căn ảnh bài đã chọn.</w:t>
+            </w:r>
+          </w:p>
+        </w:tc>
+      </w:tr>
+      <w:tr>
+        <w:tc>
+          <w:tcPr>
+            <w:tcW w:type="dxa" w:w="2880"/>
+            <w:tcMar>
+              <w:top w:w="80" w:type="dxa"/>
+              <w:start w:w="120" w:type="dxa"/>
+              <w:bottom w:w="80" w:type="dxa"/>
+              <w:end w:w="120" w:type="dxa"/>
+            </w:tcMar>
+            <w:vAlign w:val="center"/>
+          </w:tcPr>
+          <w:p>
+            <w:pPr>
+              <w:spacing w:after="0"/>
+            </w:pPr>
+            <w:r>
+              <w:rPr>
+                <w:rFonts w:ascii="Calibri" w:hAnsi="Calibri" w:eastAsia="Calibri"/>
+                <w:sz w:val="22"/>
+              </w:rPr>
               <w:t>Hẹn giờ đăng</w:t>
             </w:r>
           </w:p>
@@ -5406,6 +6897,56 @@
                 <w:rFonts w:ascii="Calibri" w:hAnsi="Calibri" w:eastAsia="Calibri"/>
                 <w:sz w:val="22"/>
               </w:rPr>
+              <w:t>Xem toàn bộ bài website</w:t>
+            </w:r>
+          </w:p>
+        </w:tc>
+        <w:tc>
+          <w:tcPr>
+            <w:tcW w:type="dxa" w:w="6480"/>
+            <w:tcMar>
+              <w:top w:w="80" w:type="dxa"/>
+              <w:start w:w="120" w:type="dxa"/>
+              <w:bottom w:w="80" w:type="dxa"/>
+              <w:end w:w="120" w:type="dxa"/>
+            </w:tcMar>
+            <w:vAlign w:val="center"/>
+          </w:tcPr>
+          <w:p>
+            <w:pPr>
+              <w:spacing w:after="0"/>
+            </w:pPr>
+            <w:r>
+              <w:rPr>
+                <w:rFonts w:ascii="Calibri" w:hAnsi="Calibri" w:eastAsia="Calibri"/>
+                <w:sz w:val="22"/>
+              </w:rPr>
+              <w:t>Mở tab Lịch sử -&gt; Toàn bộ bài trên website -&gt; Đồng bộ toàn bộ bài.</w:t>
+            </w:r>
+          </w:p>
+        </w:tc>
+      </w:tr>
+      <w:tr>
+        <w:tc>
+          <w:tcPr>
+            <w:tcW w:type="dxa" w:w="2880"/>
+            <w:tcMar>
+              <w:top w:w="80" w:type="dxa"/>
+              <w:start w:w="120" w:type="dxa"/>
+              <w:bottom w:w="80" w:type="dxa"/>
+              <w:end w:w="120" w:type="dxa"/>
+            </w:tcMar>
+            <w:vAlign w:val="center"/>
+          </w:tcPr>
+          <w:p>
+            <w:pPr>
+              <w:spacing w:after="0"/>
+            </w:pPr>
+            <w:r>
+              <w:rPr>
+                <w:rFonts w:ascii="Calibri" w:hAnsi="Calibri" w:eastAsia="Calibri"/>
+                <w:sz w:val="22"/>
+              </w:rPr>
               <w:t>Tạo lại file mẫu</w:t>
             </w:r>
           </w:p>
@@ -5477,7 +7018,7 @@
               <w:rPr>
                 <w:rFonts w:ascii="Calibri" w:hAnsi="Calibri" w:eastAsia="Calibri"/>
               </w:rPr>
-              <w:t>Cập nhật ngày 07/07/2026 theo bản app có xuất Excel kèm link bài viết và lưu lịch sử chạy.</w:t>
+              <w:t>Cập nhật ngày 10/07/2026 theo bản app có đồng bộ từ khóa phụ Rank Math, lưu website đã kết nối, nhận diện toàn bộ bài trên website, xuất bản/sửa ảnh hàng loạt, xuất Excel kèm link và lưu lịch sử chạy.</w:t>
             </w:r>
           </w:p>
         </w:tc>

</xml_diff>

<commit_message>
feat: add images to existing website posts
</commit_message>
<xml_diff>
--- a/docs/Huong_dan_su_dung_PMEDIA_Dang_Bai_Tu_Dong_WordPress.docx
+++ b/docs/Huong_dan_su_dung_PMEDIA_Dang_Bai_Tu_Dong_WordPress.docx
@@ -3643,6 +3643,46 @@
         <w:pStyle w:val="ListNumber"/>
       </w:pPr>
       <w:r>
+        <w:t>Để thêm ảnh mới vào nội dung bài đã có, chọn thư mục ảnh trong phần Thao tác hàng loạt.</w:t>
+      </w:r>
+    </w:p>
+    <w:p>
+      <w:pPr>
+        <w:pStyle w:val="ListNumber"/>
+      </w:pPr>
+      <w:r>
+        <w:t>Đặt tên ảnh theo ID hoặc slug hiển thị trong bảng: 123_thumb.jpg, 123_1.jpg, 123_2.jpg hoặc ten-bai_thumb.jpg, ten-bai_1.jpg, ten-bai_2.jpg.</w:t>
+      </w:r>
+    </w:p>
+    <w:p>
+      <w:pPr>
+        <w:pStyle w:val="ListNumber"/>
+      </w:pPr>
+      <w:r>
+        <w:t>Ảnh có hậu tố thumb, bg, thumbnail hoặc featured được đặt ở đầu bài; ảnh _1, _2, _3... được phân bố trong nội dung.</w:t>
+      </w:r>
+    </w:p>
+    <w:p>
+      <w:pPr>
+        <w:pStyle w:val="ListNumber"/>
+      </w:pPr>
+      <w:r>
+        <w:t>Chọn số ảnh tối đa mỗi bài, kích thước và cách căn ảnh, sau đó bấm Thêm ảnh vào bài đã chọn.</w:t>
+      </w:r>
+    </w:p>
+    <w:p>
+      <w:pPr>
+        <w:pStyle w:val="ListNumber"/>
+      </w:pPr>
+      <w:r>
+        <w:t>App bỏ qua ảnh đã được chèn bởi PMEDIA để tránh thêm trùng khi chạy lại. Kiểm tra cột Ghi chú/lỗi và log nếu ảnh không khớp ID hoặc slug.</w:t>
+      </w:r>
+    </w:p>
+    <w:p>
+      <w:pPr>
+        <w:pStyle w:val="ListNumber"/>
+      </w:pPr>
+      <w:r>
         <w:rPr>
           <w:rFonts w:ascii="Calibri" w:hAnsi="Calibri" w:eastAsia="Calibri"/>
         </w:rPr>

</xml_diff>